<commit_message>
docs(M08): agregar al análisis la sección de dirección de grupo y horas lectivas
Explica, según el Decreto 1850, qué es asignación académica (horas lectivas) y qué
es actividad complementaria, y dónde caen la dirección de grupo y la atención a
padres de familia.

Co-Authored-By: Claude Sonnet 5.5 <noreply@anthropic.com>
</commit_message>
<xml_diff>
--- a/doc/Análisis_M06_Klassy.docx
+++ b/doc/Análisis_M06_Klassy.docx
@@ -6379,6 +6379,7 @@
       <w:pPr>
         <w:rPr>
           <w:rFonts w:cstheme="minorHAnsi"/>
+          <w:lang w:val="en-US"/>
         </w:rPr>
       </w:pPr>
       <w:r>
@@ -6387,53 +6388,51 @@
         </w:rPr>
         <w:t xml:space="preserve">               </w:t>
       </w:r>
+      <w:proofErr w:type="gramStart"/>
+      <w:r>
+        <w:rPr>
+          <w:rFonts w:cstheme="minorHAnsi"/>
+          <w:lang w:val="en-US"/>
+        </w:rPr>
+        <w:t>subjects[</w:t>
+      </w:r>
+      <w:proofErr w:type="gramEnd"/>
+      <w:r>
+        <w:rPr>
+          <w:rFonts w:cstheme="minorHAnsi"/>
+          <w:lang w:val="en-US"/>
+        </w:rPr>
+        <w:t xml:space="preserve">]         </w:t>
+      </w:r>
       <w:proofErr w:type="spellStart"/>
-      <w:proofErr w:type="gramStart"/>
-      <w:r>
-        <w:rPr>
-          <w:rFonts w:cstheme="minorHAnsi"/>
-        </w:rPr>
-        <w:t>subjects</w:t>
+      <w:r>
+        <w:rPr>
+          <w:rFonts w:cstheme="minorHAnsi"/>
+          <w:lang w:val="en-US"/>
+        </w:rPr>
+        <w:t>area_evaluations</w:t>
       </w:r>
       <w:proofErr w:type="spellEnd"/>
       <w:r>
         <w:rPr>
           <w:rFonts w:cstheme="minorHAnsi"/>
-        </w:rPr>
-        <w:t>[</w:t>
-      </w:r>
-      <w:proofErr w:type="gramEnd"/>
-      <w:r>
-        <w:rPr>
-          <w:rFonts w:cstheme="minorHAnsi"/>
-        </w:rPr>
-        <w:t xml:space="preserve">]         </w:t>
+          <w:lang w:val="en-US"/>
+        </w:rPr>
+        <w:t xml:space="preserve">[]     </w:t>
       </w:r>
       <w:proofErr w:type="spellStart"/>
       <w:r>
         <w:rPr>
           <w:rFonts w:cstheme="minorHAnsi"/>
-        </w:rPr>
-        <w:t>area_evaluations</w:t>
+          <w:lang w:val="en-US"/>
+        </w:rPr>
+        <w:t>group_customizations</w:t>
       </w:r>
       <w:proofErr w:type="spellEnd"/>
       <w:r>
         <w:rPr>
           <w:rFonts w:cstheme="minorHAnsi"/>
-        </w:rPr>
-        <w:t xml:space="preserve">[]     </w:t>
-      </w:r>
-      <w:proofErr w:type="spellStart"/>
-      <w:r>
-        <w:rPr>
-          <w:rFonts w:cstheme="minorHAnsi"/>
-        </w:rPr>
-        <w:t>group_customizations</w:t>
-      </w:r>
-      <w:proofErr w:type="spellEnd"/>
-      <w:r>
-        <w:rPr>
-          <w:rFonts w:cstheme="minorHAnsi"/>
+          <w:lang w:val="en-US"/>
         </w:rPr>
         <w:t>[]</w:t>
       </w:r>
@@ -6442,11 +6441,13 @@
       <w:pPr>
         <w:rPr>
           <w:rFonts w:cstheme="minorHAnsi"/>
-        </w:rPr>
-      </w:pPr>
-      <w:r>
-        <w:rPr>
-          <w:rFonts w:cstheme="minorHAnsi"/>
+          <w:lang w:val="en-US"/>
+        </w:rPr>
+      </w:pPr>
+      <w:r>
+        <w:rPr>
+          <w:rFonts w:cstheme="minorHAnsi"/>
+          <w:lang w:val="en-US"/>
         </w:rPr>
         <w:t xml:space="preserve">                    │                                   │                                 │</w:t>
       </w:r>
@@ -6455,126 +6456,15 @@
       <w:pPr>
         <w:rPr>
           <w:rFonts w:cstheme="minorHAnsi"/>
-        </w:rPr>
-      </w:pPr>
-      <w:r>
-        <w:rPr>
-          <w:rFonts w:cstheme="minorHAnsi"/>
+          <w:lang w:val="en-US"/>
+        </w:rPr>
+      </w:pPr>
+      <w:r>
+        <w:rPr>
+          <w:rFonts w:cstheme="minorHAnsi"/>
+          <w:lang w:val="en-US"/>
         </w:rPr>
         <w:t xml:space="preserve">                    │                                   │                                 │</w:t>
-      </w:r>
-    </w:p>
-    <w:p>
-      <w:pPr>
-        <w:rPr>
-          <w:rFonts w:cstheme="minorHAnsi"/>
-        </w:rPr>
-      </w:pPr>
-      <w:r>
-        <w:rPr>
-          <w:rFonts w:cstheme="minorHAnsi"/>
-        </w:rPr>
-        <w:t xml:space="preserve">                    </w:t>
-      </w:r>
-      <w:r>
-        <w:rPr>
-          <w:rFonts w:ascii="Arial" w:hAnsi="Arial" w:cs="Arial"/>
-        </w:rPr>
-        <w:t>▼</w:t>
-      </w:r>
-      <w:r>
-        <w:rPr>
-          <w:rFonts w:cstheme="minorHAnsi"/>
-        </w:rPr>
-        <w:t xml:space="preserve">                                </w:t>
-      </w:r>
-      <w:r>
-        <w:rPr>
-          <w:rFonts w:ascii="Arial" w:hAnsi="Arial" w:cs="Arial"/>
-        </w:rPr>
-        <w:t>▼</w:t>
-      </w:r>
-      <w:r>
-        <w:rPr>
-          <w:rFonts w:cstheme="minorHAnsi"/>
-        </w:rPr>
-        <w:t xml:space="preserve">                               </w:t>
-      </w:r>
-      <w:r>
-        <w:rPr>
-          <w:rFonts w:ascii="Arial" w:hAnsi="Arial" w:cs="Arial"/>
-        </w:rPr>
-        <w:t>▼</w:t>
-      </w:r>
-    </w:p>
-    <w:p>
-      <w:pPr>
-        <w:rPr>
-          <w:rFonts w:cstheme="minorHAnsi"/>
-        </w:rPr>
-      </w:pPr>
-      <w:r>
-        <w:rPr>
-          <w:rFonts w:cstheme="minorHAnsi"/>
-        </w:rPr>
-        <w:t xml:space="preserve">              </w:t>
-      </w:r>
-      <w:proofErr w:type="spellStart"/>
-      <w:r>
-        <w:rPr>
-          <w:rFonts w:cstheme="minorHAnsi"/>
-        </w:rPr>
-        <w:t>subject_id</w:t>
-      </w:r>
-      <w:proofErr w:type="spellEnd"/>
-      <w:r>
-        <w:rPr>
-          <w:rFonts w:cstheme="minorHAnsi"/>
-        </w:rPr>
-        <w:t xml:space="preserve">                   </w:t>
-      </w:r>
-      <w:proofErr w:type="spellStart"/>
-      <w:r>
-        <w:rPr>
-          <w:rFonts w:cstheme="minorHAnsi"/>
-        </w:rPr>
-        <w:t>area_id</w:t>
-      </w:r>
-      <w:proofErr w:type="spellEnd"/>
-      <w:r>
-        <w:rPr>
-          <w:rFonts w:cstheme="minorHAnsi"/>
-        </w:rPr>
-        <w:t xml:space="preserve">                   </w:t>
-      </w:r>
-      <w:proofErr w:type="spellStart"/>
-      <w:r>
-        <w:rPr>
-          <w:rFonts w:cstheme="minorHAnsi"/>
-        </w:rPr>
-        <w:t>group_id</w:t>
-      </w:r>
-      <w:proofErr w:type="spellEnd"/>
-    </w:p>
-    <w:p>
-      <w:pPr>
-        <w:rPr>
-          <w:rFonts w:cstheme="minorHAnsi"/>
-          <w:lang w:val="en-US"/>
-        </w:rPr>
-      </w:pPr>
-      <w:r>
-        <w:rPr>
-          <w:rFonts w:cstheme="minorHAnsi"/>
-        </w:rPr>
-        <w:t xml:space="preserve">                    </w:t>
-      </w:r>
-      <w:r>
-        <w:rPr>
-          <w:rFonts w:cstheme="minorHAnsi"/>
-          <w:lang w:val="en-US"/>
-        </w:rPr>
-        <w:t>│                                   │                               │</w:t>
       </w:r>
     </w:p>
     <w:p>
@@ -6603,21 +6493,7 @@
           <w:rFonts w:cstheme="minorHAnsi"/>
           <w:lang w:val="en-US"/>
         </w:rPr>
-        <w:t xml:space="preserve">                  </w:t>
-      </w:r>
-      <w:r>
-        <w:rPr>
-          <w:rFonts w:cstheme="minorHAnsi"/>
-          <w:lang w:val="en-US"/>
-        </w:rPr>
-        <w:t xml:space="preserve">          </w:t>
-      </w:r>
-      <w:r>
-        <w:rPr>
-          <w:rFonts w:cstheme="minorHAnsi"/>
-          <w:lang w:val="en-US"/>
-        </w:rPr>
-        <w:t xml:space="preserve">    </w:t>
+        <w:t xml:space="preserve">                                </w:t>
       </w:r>
       <w:r>
         <w:rPr>
@@ -6631,21 +6507,7 @@
           <w:rFonts w:cstheme="minorHAnsi"/>
           <w:lang w:val="en-US"/>
         </w:rPr>
-        <w:t xml:space="preserve">             </w:t>
-      </w:r>
-      <w:r>
-        <w:rPr>
-          <w:rFonts w:cstheme="minorHAnsi"/>
-          <w:lang w:val="en-US"/>
-        </w:rPr>
-        <w:t xml:space="preserve">       </w:t>
-      </w:r>
-      <w:r>
-        <w:rPr>
-          <w:rFonts w:cstheme="minorHAnsi"/>
-          <w:lang w:val="en-US"/>
-        </w:rPr>
-        <w:t xml:space="preserve">         </w:t>
+        <w:t xml:space="preserve">                               </w:t>
       </w:r>
       <w:r>
         <w:rPr>
@@ -6667,6 +6529,162 @@
           <w:rFonts w:cstheme="minorHAnsi"/>
           <w:lang w:val="en-US"/>
         </w:rPr>
+        <w:t xml:space="preserve">              </w:t>
+      </w:r>
+      <w:proofErr w:type="spellStart"/>
+      <w:r>
+        <w:rPr>
+          <w:rFonts w:cstheme="minorHAnsi"/>
+          <w:lang w:val="en-US"/>
+        </w:rPr>
+        <w:t>subject_id</w:t>
+      </w:r>
+      <w:proofErr w:type="spellEnd"/>
+      <w:r>
+        <w:rPr>
+          <w:rFonts w:cstheme="minorHAnsi"/>
+          <w:lang w:val="en-US"/>
+        </w:rPr>
+        <w:t xml:space="preserve">                   </w:t>
+      </w:r>
+      <w:proofErr w:type="spellStart"/>
+      <w:r>
+        <w:rPr>
+          <w:rFonts w:cstheme="minorHAnsi"/>
+          <w:lang w:val="en-US"/>
+        </w:rPr>
+        <w:t>area_id</w:t>
+      </w:r>
+      <w:proofErr w:type="spellEnd"/>
+      <w:r>
+        <w:rPr>
+          <w:rFonts w:cstheme="minorHAnsi"/>
+          <w:lang w:val="en-US"/>
+        </w:rPr>
+        <w:t xml:space="preserve">                   </w:t>
+      </w:r>
+      <w:proofErr w:type="spellStart"/>
+      <w:r>
+        <w:rPr>
+          <w:rFonts w:cstheme="minorHAnsi"/>
+          <w:lang w:val="en-US"/>
+        </w:rPr>
+        <w:t>group_id</w:t>
+      </w:r>
+      <w:proofErr w:type="spellEnd"/>
+    </w:p>
+    <w:p>
+      <w:pPr>
+        <w:rPr>
+          <w:rFonts w:cstheme="minorHAnsi"/>
+          <w:lang w:val="en-US"/>
+        </w:rPr>
+      </w:pPr>
+      <w:r>
+        <w:rPr>
+          <w:rFonts w:cstheme="minorHAnsi"/>
+          <w:lang w:val="en-US"/>
+        </w:rPr>
+        <w:t xml:space="preserve">                    </w:t>
+      </w:r>
+      <w:r>
+        <w:rPr>
+          <w:rFonts w:cstheme="minorHAnsi"/>
+          <w:lang w:val="en-US"/>
+        </w:rPr>
+        <w:t>│                                   │                               │</w:t>
+      </w:r>
+    </w:p>
+    <w:p>
+      <w:pPr>
+        <w:rPr>
+          <w:rFonts w:cstheme="minorHAnsi"/>
+          <w:lang w:val="en-US"/>
+        </w:rPr>
+      </w:pPr>
+      <w:r>
+        <w:rPr>
+          <w:rFonts w:cstheme="minorHAnsi"/>
+          <w:lang w:val="en-US"/>
+        </w:rPr>
+        <w:t xml:space="preserve">                    </w:t>
+      </w:r>
+      <w:r>
+        <w:rPr>
+          <w:rFonts w:ascii="Arial" w:hAnsi="Arial" w:cs="Arial"/>
+          <w:lang w:val="en-US"/>
+        </w:rPr>
+        <w:t>▼</w:t>
+      </w:r>
+      <w:r>
+        <w:rPr>
+          <w:rFonts w:cstheme="minorHAnsi"/>
+          <w:lang w:val="en-US"/>
+        </w:rPr>
+        <w:t xml:space="preserve">                  </w:t>
+      </w:r>
+      <w:r>
+        <w:rPr>
+          <w:rFonts w:cstheme="minorHAnsi"/>
+          <w:lang w:val="en-US"/>
+        </w:rPr>
+        <w:t xml:space="preserve">          </w:t>
+      </w:r>
+      <w:r>
+        <w:rPr>
+          <w:rFonts w:cstheme="minorHAnsi"/>
+          <w:lang w:val="en-US"/>
+        </w:rPr>
+        <w:t xml:space="preserve">    </w:t>
+      </w:r>
+      <w:r>
+        <w:rPr>
+          <w:rFonts w:ascii="Arial" w:hAnsi="Arial" w:cs="Arial"/>
+          <w:lang w:val="en-US"/>
+        </w:rPr>
+        <w:t>▼</w:t>
+      </w:r>
+      <w:r>
+        <w:rPr>
+          <w:rFonts w:cstheme="minorHAnsi"/>
+          <w:lang w:val="en-US"/>
+        </w:rPr>
+        <w:t xml:space="preserve">             </w:t>
+      </w:r>
+      <w:r>
+        <w:rPr>
+          <w:rFonts w:cstheme="minorHAnsi"/>
+          <w:lang w:val="en-US"/>
+        </w:rPr>
+        <w:t xml:space="preserve">       </w:t>
+      </w:r>
+      <w:r>
+        <w:rPr>
+          <w:rFonts w:cstheme="minorHAnsi"/>
+          <w:lang w:val="en-US"/>
+        </w:rPr>
+        <w:t xml:space="preserve">         </w:t>
+      </w:r>
+      <w:r>
+        <w:rPr>
+          <w:rFonts w:ascii="Arial" w:hAnsi="Arial" w:cs="Arial"/>
+          <w:lang w:val="en-US"/>
+        </w:rPr>
+        <w:t>▼</w:t>
+      </w:r>
+    </w:p>
+    <w:p>
+      <w:pPr>
+        <w:rPr>
+          <w:rFonts w:cstheme="minorHAnsi"/>
+          <w:lang w:val="en-US"/>
+        </w:rPr>
+      </w:pPr>
+      <w:r>
+        <w:rPr>
+          <w:rFonts w:cstheme="minorHAnsi"/>
+          <w:lang w:val="en-US"/>
+        </w:rPr>
         <w:t xml:space="preserve">             m06_subjects             m06_areas             </w:t>
       </w:r>
       <w:proofErr w:type="spellStart"/>
@@ -6762,6 +6780,441 @@
           <w:rFonts w:cstheme="minorHAnsi"/>
         </w:rPr>
       </w:pPr>
+    </w:p>
+    <w:p>
+      <w:pPr>
+        <w:rPr>
+          <w:rFonts w:cstheme="minorHAnsi"/>
+        </w:rPr>
+      </w:pPr>
+    </w:p>
+    <w:p>
+      <w:pPr>
+        <w:rPr>
+          <w:rFonts w:cstheme="minorHAnsi"/>
+        </w:rPr>
+      </w:pPr>
+    </w:p>
+    <w:p>
+      <w:pPr>
+        <w:rPr>
+          <w:rFonts w:cstheme="minorHAnsi"/>
+        </w:rPr>
+      </w:pPr>
+    </w:p>
+    <w:p>
+      <w:pPr>
+        <w:rPr>
+          <w:rFonts w:cstheme="minorHAnsi"/>
+        </w:rPr>
+      </w:pPr>
+    </w:p>
+    <w:p>
+      <w:pPr>
+        <w:rPr>
+          <w:rFonts w:cstheme="minorHAnsi"/>
+        </w:rPr>
+      </w:pPr>
+    </w:p>
+    <w:p>
+      <w:pPr>
+        <w:rPr>
+          <w:rFonts w:cstheme="minorHAnsi"/>
+        </w:rPr>
+      </w:pPr>
+    </w:p>
+    <w:p>
+      <w:pPr>
+        <w:rPr>
+          <w:rFonts w:cstheme="minorHAnsi"/>
+        </w:rPr>
+      </w:pPr>
+    </w:p>
+    <w:p>
+      <w:pPr>
+        <w:rPr>
+          <w:rFonts w:cstheme="minorHAnsi"/>
+        </w:rPr>
+      </w:pPr>
+    </w:p>
+    <w:p>
+      <w:pPr>
+        <w:rPr>
+          <w:rFonts w:cstheme="minorHAnsi"/>
+        </w:rPr>
+      </w:pPr>
+    </w:p>
+    <w:p>
+      <w:pPr>
+        <w:rPr>
+          <w:rFonts w:cstheme="minorHAnsi"/>
+        </w:rPr>
+      </w:pPr>
+    </w:p>
+    <w:p>
+      <w:pPr>
+        <w:rPr>
+          <w:rFonts w:cstheme="minorHAnsi"/>
+        </w:rPr>
+      </w:pPr>
+    </w:p>
+    <w:p>
+      <w:pPr>
+        <w:rPr>
+          <w:rFonts w:cstheme="minorHAnsi"/>
+        </w:rPr>
+      </w:pPr>
+    </w:p>
+    <w:p>
+      <w:pPr>
+        <w:rPr>
+          <w:rFonts w:cstheme="minorHAnsi"/>
+        </w:rPr>
+      </w:pPr>
+    </w:p>
+    <w:p>
+      <w:pPr>
+        <w:rPr>
+          <w:rFonts w:cstheme="minorHAnsi"/>
+        </w:rPr>
+      </w:pPr>
+    </w:p>
+    <w:p>
+      <w:pPr>
+        <w:rPr>
+          <w:rFonts w:cstheme="minorHAnsi"/>
+        </w:rPr>
+      </w:pPr>
+    </w:p>
+    <w:p>
+      <w:pPr>
+        <w:rPr>
+          <w:rFonts w:cstheme="minorHAnsi"/>
+        </w:rPr>
+      </w:pPr>
+    </w:p>
+    <w:p>
+      <w:pPr>
+        <w:rPr>
+          <w:rFonts w:cstheme="minorHAnsi"/>
+        </w:rPr>
+      </w:pPr>
+    </w:p>
+    <w:p>
+      <w:pPr>
+        <w:rPr>
+          <w:rFonts w:cstheme="minorHAnsi"/>
+        </w:rPr>
+      </w:pPr>
+      <w:r>
+        <w:rPr>
+          <w:rFonts w:cstheme="minorHAnsi"/>
+        </w:rPr>
+        <w:t xml:space="preserve">MÓDULO 08 </w:t>
+      </w:r>
+    </w:p>
+    <w:p>
+      <w:pPr>
+        <w:rPr>
+          <w:rFonts w:cstheme="minorHAnsi"/>
+        </w:rPr>
+      </w:pPr>
+    </w:p>
+    <w:p>
+      <w:pPr>
+        <w:pStyle w:val="Ttulo3"/>
+      </w:pPr>
+      <w:r>
+        <w:t>1. Dirección de grupo y reuniones de padres: ¿cuentan o no como horas lectivas?</w:t>
+      </w:r>
+    </w:p>
+    <w:p>
+      <w:pPr>
+        <w:spacing w:before="100" w:beforeAutospacing="1" w:after="100" w:afterAutospacing="1"/>
+      </w:pPr>
+      <w:r>
+        <w:t xml:space="preserve">Para entender por qué el sistema le pone </w:t>
+      </w:r>
+      <w:r>
+        <w:rPr>
+          <w:rStyle w:val="CdigoHTML"/>
+          <w:rFonts w:eastAsiaTheme="minorHAnsi"/>
+        </w:rPr>
+        <w:t>0</w:t>
+      </w:r>
+      <w:r>
+        <w:t xml:space="preserve"> a la dirección de grupo, hay que diferenciar dos conceptos clave del Decreto 1850:</w:t>
+      </w:r>
+    </w:p>
+    <w:p>
+      <w:pPr>
+        <w:numPr>
+          <w:ilvl w:val="0"/>
+          <w:numId w:val="13"/>
+        </w:numPr>
+        <w:spacing w:before="100" w:beforeAutospacing="1" w:after="100" w:afterAutospacing="1" w:line="240" w:lineRule="auto"/>
+      </w:pPr>
+      <w:r>
+        <w:rPr>
+          <w:rStyle w:val="Textoennegrita"/>
+        </w:rPr>
+        <w:t>Asignación Académica (Horas Lectivas de Clase):</w:t>
+      </w:r>
+      <w:r>
+        <w:t xml:space="preserve"> Es el tiempo que el docente pasa </w:t>
+      </w:r>
+      <w:r>
+        <w:rPr>
+          <w:rStyle w:val="Textoennegrita"/>
+        </w:rPr>
+        <w:t>frente a los estudiantes dictando clase</w:t>
+      </w:r>
+      <w:r>
+        <w:t xml:space="preserve"> (las 20h en Preescolar, 25h en Primaria, 22h en Secundaria). Este es el número que vigila el semáforo.</w:t>
+      </w:r>
+    </w:p>
+    <w:p>
+      <w:pPr>
+        <w:numPr>
+          <w:ilvl w:val="0"/>
+          <w:numId w:val="13"/>
+        </w:numPr>
+        <w:spacing w:before="100" w:beforeAutospacing="1" w:after="100" w:afterAutospacing="1" w:line="240" w:lineRule="auto"/>
+      </w:pPr>
+      <w:r>
+        <w:rPr>
+          <w:rStyle w:val="Textoennegrita"/>
+        </w:rPr>
+        <w:t>Jornada Laboral Completa (40 horas semanales / 8 diarias):</w:t>
+      </w:r>
+      <w:r>
+        <w:t xml:space="preserve"> Todo docente en Colombia debe cumplir 40 horas a la semana. Al menos 30 horas deben ser presenciales en la institución (6 horas diarias), y </w:t>
+      </w:r>
+      <w:proofErr w:type="gramStart"/>
+      <w:r>
+        <w:t>las 10 restantes</w:t>
+      </w:r>
+      <w:proofErr w:type="gramEnd"/>
+      <w:r>
+        <w:t xml:space="preserve"> en actividades complementarias.</w:t>
+      </w:r>
+    </w:p>
+    <w:p>
+      <w:pPr>
+        <w:pStyle w:val="Ttulo4"/>
+      </w:pPr>
+      <w:r>
+        <w:t>¿Dónde entran las reuniones de padres y la dirección de grupo?</w:t>
+      </w:r>
+    </w:p>
+    <w:p>
+      <w:pPr>
+        <w:spacing w:before="100" w:beforeAutospacing="1" w:after="100" w:afterAutospacing="1"/>
+      </w:pPr>
+      <w:r>
+        <w:t xml:space="preserve">Según el </w:t>
+      </w:r>
+      <w:r>
+        <w:rPr>
+          <w:rStyle w:val="Textoennegrita"/>
+        </w:rPr>
+        <w:t>Artículo 9 del Decreto 1850</w:t>
+      </w:r>
+      <w:r>
+        <w:t>:</w:t>
+      </w:r>
+    </w:p>
+    <w:p>
+      <w:pPr>
+        <w:spacing w:before="100" w:beforeAutospacing="1" w:after="100" w:afterAutospacing="1"/>
+      </w:pPr>
+      <w:r>
+        <w:rPr>
+          <w:rStyle w:val="nfasis"/>
+        </w:rPr>
+        <w:t xml:space="preserve">"El tiempo total que los docentes deben dedicar (...) incluye el cumplimiento de su asignación académica, y la ejecución de actividades curriculares complementarias tales como: administración del proceso educativo, preparación de clase, evaluación, </w:t>
+      </w:r>
+      <w:r>
+        <w:rPr>
+          <w:rStyle w:val="Textoennegrita"/>
+          <w:i/>
+          <w:iCs/>
+        </w:rPr>
+        <w:t>atención a la comunidad, en especial a los padres de familia</w:t>
+      </w:r>
+      <w:r>
+        <w:rPr>
+          <w:rStyle w:val="nfasis"/>
+        </w:rPr>
+        <w:t>, y actividades curriculares no lectivas..."</w:t>
+      </w:r>
+    </w:p>
+    <w:p>
+      <w:pPr>
+        <w:spacing w:before="100" w:beforeAutospacing="1" w:after="100" w:afterAutospacing="1"/>
+      </w:pPr>
+      <w:r>
+        <w:t>Por ley:</w:t>
+      </w:r>
+    </w:p>
+    <w:p>
+      <w:pPr>
+        <w:numPr>
+          <w:ilvl w:val="0"/>
+          <w:numId w:val="14"/>
+        </w:numPr>
+        <w:spacing w:before="100" w:beforeAutospacing="1" w:after="100" w:afterAutospacing="1" w:line="240" w:lineRule="auto"/>
+      </w:pPr>
+      <w:r>
+        <w:rPr>
+          <w:rStyle w:val="Textoennegrita"/>
+        </w:rPr>
+        <w:t>La atención y reuniones de padres:</w:t>
+      </w:r>
+      <w:r>
+        <w:t xml:space="preserve"> </w:t>
+      </w:r>
+      <w:r>
+        <w:rPr>
+          <w:rStyle w:val="Textoennegrita"/>
+        </w:rPr>
+        <w:t>NO son horas de clase</w:t>
+      </w:r>
+      <w:r>
+        <w:t xml:space="preserve">, por lo que </w:t>
+      </w:r>
+      <w:r>
+        <w:rPr>
+          <w:rStyle w:val="Textoennegrita"/>
+        </w:rPr>
+        <w:t>no suman</w:t>
+      </w:r>
+      <w:r>
+        <w:t xml:space="preserve"> a la asignación académica semanal (las 22 horas). Se realizan dentro de las 18 horas complementarias que el profesor tiene para completar su jornada laboral de 40h.</w:t>
+      </w:r>
+    </w:p>
+    <w:p>
+      <w:pPr>
+        <w:numPr>
+          <w:ilvl w:val="0"/>
+          <w:numId w:val="14"/>
+        </w:numPr>
+        <w:spacing w:before="100" w:beforeAutospacing="1" w:after="100" w:afterAutospacing="1" w:line="240" w:lineRule="auto"/>
+      </w:pPr>
+      <w:r>
+        <w:rPr>
+          <w:rStyle w:val="Textoennegrita"/>
+        </w:rPr>
+        <w:t>La Dirección de Grupo:</w:t>
+      </w:r>
+      <w:r>
+        <w:t xml:space="preserve"> Tradicionalmente es una labor formativa y de acompañamiento. Si en el colegio la dirección de grupo no es una materia del horario regular (como "Orientación de Grupo"), se considera labor complementaria y por eso el sistema le pone </w:t>
+      </w:r>
+      <w:r>
+        <w:rPr>
+          <w:rStyle w:val="Textoennegrita"/>
+        </w:rPr>
+        <w:t>0 horas lectivas</w:t>
+      </w:r>
+      <w:r>
+        <w:t xml:space="preserve">. </w:t>
+      </w:r>
+    </w:p>
+    <w:p>
+      <w:pPr>
+        <w:numPr>
+          <w:ilvl w:val="1"/>
+          <w:numId w:val="14"/>
+        </w:numPr>
+        <w:spacing w:before="100" w:beforeAutospacing="1" w:after="100" w:afterAutospacing="1" w:line="240" w:lineRule="auto"/>
+      </w:pPr>
+      <w:r>
+        <w:rPr>
+          <w:rStyle w:val="nfasis"/>
+        </w:rPr>
+        <w:t>Ojo:</w:t>
+      </w:r>
+      <w:r>
+        <w:t xml:space="preserve"> Si en el Proyecto Educativo Institucional (PEI) de tu colegio la dirección de grupo </w:t>
+      </w:r>
+      <w:r>
+        <w:rPr>
+          <w:rStyle w:val="Textoennegrita"/>
+        </w:rPr>
+        <w:t>sí tiene 1 o 2 horas fijas semanales en el horario de clase</w:t>
+      </w:r>
+      <w:r>
+        <w:t>, en ese caso el colegio suele configurarla en el Plan de Estudios (M06) como una materia curricular para que sume a la carga.</w:t>
+      </w:r>
+    </w:p>
+    <w:p>
+      <w:pPr>
+        <w:rPr>
+          <w:rFonts w:cstheme="minorHAnsi"/>
+        </w:rPr>
+      </w:pPr>
+    </w:p>
+    <w:p>
+      <w:pPr>
+        <w:rPr>
+          <w:rFonts w:cstheme="minorHAnsi"/>
+        </w:rPr>
+      </w:pPr>
+    </w:p>
+    <w:p>
+      <w:pPr>
+        <w:rPr>
+          <w:rFonts w:cstheme="minorHAnsi"/>
+        </w:rPr>
+      </w:pPr>
+    </w:p>
+    <w:p>
+      <w:pPr>
+        <w:rPr>
+          <w:rFonts w:cstheme="minorHAnsi"/>
+        </w:rPr>
+      </w:pPr>
+      <w:r>
+        <w:rPr>
+          <w:rFonts w:cstheme="minorHAnsi"/>
+        </w:rPr>
+        <w:lastRenderedPageBreak/>
+        <w:drawing>
+          <wp:inline distT="0" distB="0" distL="0" distR="0" wp14:anchorId="19F4C7F5" wp14:editId="5EA7B301">
+            <wp:extent cx="3886537" cy="3520745"/>
+            <wp:effectExtent l="0" t="0" r="0" b="3810"/>
+            <wp:docPr id="1" name="Imagen 1"/>
+            <wp:cNvGraphicFramePr>
+              <a:graphicFrameLocks xmlns:a="http://schemas.openxmlformats.org/drawingml/2006/main" noChangeAspect="1"/>
+            </wp:cNvGraphicFramePr>
+            <a:graphic xmlns:a="http://schemas.openxmlformats.org/drawingml/2006/main">
+              <a:graphicData uri="http://schemas.openxmlformats.org/drawingml/2006/picture">
+                <pic:pic xmlns:pic="http://schemas.openxmlformats.org/drawingml/2006/picture">
+                  <pic:nvPicPr>
+                    <pic:cNvPr id="1" name=""/>
+                    <pic:cNvPicPr/>
+                  </pic:nvPicPr>
+                  <pic:blipFill>
+                    <a:blip r:embed="rId7"/>
+                    <a:stretch>
+                      <a:fillRect/>
+                    </a:stretch>
+                  </pic:blipFill>
+                  <pic:spPr>
+                    <a:xfrm>
+                      <a:off x="0" y="0"/>
+                      <a:ext cx="3886537" cy="3520745"/>
+                    </a:xfrm>
+                    <a:prstGeom prst="rect">
+                      <a:avLst/>
+                    </a:prstGeom>
+                  </pic:spPr>
+                </pic:pic>
+              </a:graphicData>
+            </a:graphic>
+          </wp:inline>
+        </w:drawing>
+      </w:r>
     </w:p>
     <w:sectPr>
       <w:pgSz w:w="12240" w:h="15840"/>
@@ -7141,6 +7594,155 @@
     </w:lvl>
   </w:abstractNum>
   <w:abstractNum w:abstractNumId="3" w15:restartNumberingAfterBreak="0">
+    <w:nsid w:val="382946E4"/>
+    <w:multiLevelType w:val="multilevel"/>
+    <w:tmpl w:val="9DE290EC"/>
+    <w:lvl w:ilvl="0">
+      <w:start w:val="1"/>
+      <w:numFmt w:val="bullet"/>
+      <w:lvlText w:val=""/>
+      <w:lvlJc w:val="left"/>
+      <w:pPr>
+        <w:tabs>
+          <w:tab w:val="num" w:pos="720"/>
+        </w:tabs>
+        <w:ind w:left="720" w:hanging="360"/>
+      </w:pPr>
+      <w:rPr>
+        <w:rFonts w:ascii="Symbol" w:hAnsi="Symbol" w:hint="default"/>
+        <w:sz w:val="20"/>
+      </w:rPr>
+    </w:lvl>
+    <w:lvl w:ilvl="1" w:tentative="1">
+      <w:start w:val="1"/>
+      <w:numFmt w:val="bullet"/>
+      <w:lvlText w:val="o"/>
+      <w:lvlJc w:val="left"/>
+      <w:pPr>
+        <w:tabs>
+          <w:tab w:val="num" w:pos="1440"/>
+        </w:tabs>
+        <w:ind w:left="1440" w:hanging="360"/>
+      </w:pPr>
+      <w:rPr>
+        <w:rFonts w:ascii="Courier New" w:hAnsi="Courier New" w:hint="default"/>
+        <w:sz w:val="20"/>
+      </w:rPr>
+    </w:lvl>
+    <w:lvl w:ilvl="2" w:tentative="1">
+      <w:start w:val="1"/>
+      <w:numFmt w:val="bullet"/>
+      <w:lvlText w:val=""/>
+      <w:lvlJc w:val="left"/>
+      <w:pPr>
+        <w:tabs>
+          <w:tab w:val="num" w:pos="2160"/>
+        </w:tabs>
+        <w:ind w:left="2160" w:hanging="360"/>
+      </w:pPr>
+      <w:rPr>
+        <w:rFonts w:ascii="Wingdings" w:hAnsi="Wingdings" w:hint="default"/>
+        <w:sz w:val="20"/>
+      </w:rPr>
+    </w:lvl>
+    <w:lvl w:ilvl="3" w:tentative="1">
+      <w:start w:val="1"/>
+      <w:numFmt w:val="bullet"/>
+      <w:lvlText w:val=""/>
+      <w:lvlJc w:val="left"/>
+      <w:pPr>
+        <w:tabs>
+          <w:tab w:val="num" w:pos="2880"/>
+        </w:tabs>
+        <w:ind w:left="2880" w:hanging="360"/>
+      </w:pPr>
+      <w:rPr>
+        <w:rFonts w:ascii="Wingdings" w:hAnsi="Wingdings" w:hint="default"/>
+        <w:sz w:val="20"/>
+      </w:rPr>
+    </w:lvl>
+    <w:lvl w:ilvl="4" w:tentative="1">
+      <w:start w:val="1"/>
+      <w:numFmt w:val="bullet"/>
+      <w:lvlText w:val=""/>
+      <w:lvlJc w:val="left"/>
+      <w:pPr>
+        <w:tabs>
+          <w:tab w:val="num" w:pos="3600"/>
+        </w:tabs>
+        <w:ind w:left="3600" w:hanging="360"/>
+      </w:pPr>
+      <w:rPr>
+        <w:rFonts w:ascii="Wingdings" w:hAnsi="Wingdings" w:hint="default"/>
+        <w:sz w:val="20"/>
+      </w:rPr>
+    </w:lvl>
+    <w:lvl w:ilvl="5" w:tentative="1">
+      <w:start w:val="1"/>
+      <w:numFmt w:val="bullet"/>
+      <w:lvlText w:val=""/>
+      <w:lvlJc w:val="left"/>
+      <w:pPr>
+        <w:tabs>
+          <w:tab w:val="num" w:pos="4320"/>
+        </w:tabs>
+        <w:ind w:left="4320" w:hanging="360"/>
+      </w:pPr>
+      <w:rPr>
+        <w:rFonts w:ascii="Wingdings" w:hAnsi="Wingdings" w:hint="default"/>
+        <w:sz w:val="20"/>
+      </w:rPr>
+    </w:lvl>
+    <w:lvl w:ilvl="6" w:tentative="1">
+      <w:start w:val="1"/>
+      <w:numFmt w:val="bullet"/>
+      <w:lvlText w:val=""/>
+      <w:lvlJc w:val="left"/>
+      <w:pPr>
+        <w:tabs>
+          <w:tab w:val="num" w:pos="5040"/>
+        </w:tabs>
+        <w:ind w:left="5040" w:hanging="360"/>
+      </w:pPr>
+      <w:rPr>
+        <w:rFonts w:ascii="Wingdings" w:hAnsi="Wingdings" w:hint="default"/>
+        <w:sz w:val="20"/>
+      </w:rPr>
+    </w:lvl>
+    <w:lvl w:ilvl="7" w:tentative="1">
+      <w:start w:val="1"/>
+      <w:numFmt w:val="bullet"/>
+      <w:lvlText w:val=""/>
+      <w:lvlJc w:val="left"/>
+      <w:pPr>
+        <w:tabs>
+          <w:tab w:val="num" w:pos="5760"/>
+        </w:tabs>
+        <w:ind w:left="5760" w:hanging="360"/>
+      </w:pPr>
+      <w:rPr>
+        <w:rFonts w:ascii="Wingdings" w:hAnsi="Wingdings" w:hint="default"/>
+        <w:sz w:val="20"/>
+      </w:rPr>
+    </w:lvl>
+    <w:lvl w:ilvl="8" w:tentative="1">
+      <w:start w:val="1"/>
+      <w:numFmt w:val="bullet"/>
+      <w:lvlText w:val=""/>
+      <w:lvlJc w:val="left"/>
+      <w:pPr>
+        <w:tabs>
+          <w:tab w:val="num" w:pos="6480"/>
+        </w:tabs>
+        <w:ind w:left="6480" w:hanging="360"/>
+      </w:pPr>
+      <w:rPr>
+        <w:rFonts w:ascii="Wingdings" w:hAnsi="Wingdings" w:hint="default"/>
+        <w:sz w:val="20"/>
+      </w:rPr>
+    </w:lvl>
+  </w:abstractNum>
+  <w:abstractNum w:abstractNumId="4" w15:restartNumberingAfterBreak="0">
     <w:nsid w:val="3B014CC8"/>
     <w:multiLevelType w:val="hybridMultilevel"/>
     <w:tmpl w:val="AD38BB22"/>
@@ -7253,7 +7855,7 @@
       </w:rPr>
     </w:lvl>
   </w:abstractNum>
-  <w:abstractNum w:abstractNumId="4" w15:restartNumberingAfterBreak="0">
+  <w:abstractNum w:abstractNumId="5" w15:restartNumberingAfterBreak="0">
     <w:nsid w:val="3F5A1128"/>
     <w:multiLevelType w:val="hybridMultilevel"/>
     <w:tmpl w:val="C776A448"/>
@@ -7366,7 +7968,7 @@
       </w:rPr>
     </w:lvl>
   </w:abstractNum>
-  <w:abstractNum w:abstractNumId="5" w15:restartNumberingAfterBreak="0">
+  <w:abstractNum w:abstractNumId="6" w15:restartNumberingAfterBreak="0">
     <w:nsid w:val="486C25C0"/>
     <w:multiLevelType w:val="multilevel"/>
     <w:tmpl w:val="1230032C"/>
@@ -7511,7 +8113,7 @@
       </w:rPr>
     </w:lvl>
   </w:abstractNum>
-  <w:abstractNum w:abstractNumId="6" w15:restartNumberingAfterBreak="0">
+  <w:abstractNum w:abstractNumId="7" w15:restartNumberingAfterBreak="0">
     <w:nsid w:val="4C2E36D4"/>
     <w:multiLevelType w:val="multilevel"/>
     <w:tmpl w:val="38A687B8"/>
@@ -7636,7 +8238,124 @@
       </w:pPr>
     </w:lvl>
   </w:abstractNum>
-  <w:abstractNum w:abstractNumId="7" w15:restartNumberingAfterBreak="0">
+  <w:abstractNum w:abstractNumId="8" w15:restartNumberingAfterBreak="0">
+    <w:nsid w:val="4CF8110B"/>
+    <w:multiLevelType w:val="multilevel"/>
+    <w:tmpl w:val="210AC862"/>
+    <w:lvl w:ilvl="0">
+      <w:start w:val="1"/>
+      <w:numFmt w:val="decimal"/>
+      <w:lvlText w:val="%1."/>
+      <w:lvlJc w:val="left"/>
+      <w:pPr>
+        <w:tabs>
+          <w:tab w:val="num" w:pos="720"/>
+        </w:tabs>
+        <w:ind w:left="720" w:hanging="360"/>
+      </w:pPr>
+    </w:lvl>
+    <w:lvl w:ilvl="1">
+      <w:start w:val="1"/>
+      <w:numFmt w:val="bullet"/>
+      <w:lvlText w:val="o"/>
+      <w:lvlJc w:val="left"/>
+      <w:pPr>
+        <w:tabs>
+          <w:tab w:val="num" w:pos="1440"/>
+        </w:tabs>
+        <w:ind w:left="1440" w:hanging="360"/>
+      </w:pPr>
+      <w:rPr>
+        <w:rFonts w:ascii="Courier New" w:hAnsi="Courier New" w:hint="default"/>
+        <w:sz w:val="20"/>
+      </w:rPr>
+    </w:lvl>
+    <w:lvl w:ilvl="2" w:tentative="1">
+      <w:start w:val="1"/>
+      <w:numFmt w:val="decimal"/>
+      <w:lvlText w:val="%3."/>
+      <w:lvlJc w:val="left"/>
+      <w:pPr>
+        <w:tabs>
+          <w:tab w:val="num" w:pos="2160"/>
+        </w:tabs>
+        <w:ind w:left="2160" w:hanging="360"/>
+      </w:pPr>
+    </w:lvl>
+    <w:lvl w:ilvl="3" w:tentative="1">
+      <w:start w:val="1"/>
+      <w:numFmt w:val="decimal"/>
+      <w:lvlText w:val="%4."/>
+      <w:lvlJc w:val="left"/>
+      <w:pPr>
+        <w:tabs>
+          <w:tab w:val="num" w:pos="2880"/>
+        </w:tabs>
+        <w:ind w:left="2880" w:hanging="360"/>
+      </w:pPr>
+    </w:lvl>
+    <w:lvl w:ilvl="4" w:tentative="1">
+      <w:start w:val="1"/>
+      <w:numFmt w:val="decimal"/>
+      <w:lvlText w:val="%5."/>
+      <w:lvlJc w:val="left"/>
+      <w:pPr>
+        <w:tabs>
+          <w:tab w:val="num" w:pos="3600"/>
+        </w:tabs>
+        <w:ind w:left="3600" w:hanging="360"/>
+      </w:pPr>
+    </w:lvl>
+    <w:lvl w:ilvl="5" w:tentative="1">
+      <w:start w:val="1"/>
+      <w:numFmt w:val="decimal"/>
+      <w:lvlText w:val="%6."/>
+      <w:lvlJc w:val="left"/>
+      <w:pPr>
+        <w:tabs>
+          <w:tab w:val="num" w:pos="4320"/>
+        </w:tabs>
+        <w:ind w:left="4320" w:hanging="360"/>
+      </w:pPr>
+    </w:lvl>
+    <w:lvl w:ilvl="6" w:tentative="1">
+      <w:start w:val="1"/>
+      <w:numFmt w:val="decimal"/>
+      <w:lvlText w:val="%7."/>
+      <w:lvlJc w:val="left"/>
+      <w:pPr>
+        <w:tabs>
+          <w:tab w:val="num" w:pos="5040"/>
+        </w:tabs>
+        <w:ind w:left="5040" w:hanging="360"/>
+      </w:pPr>
+    </w:lvl>
+    <w:lvl w:ilvl="7" w:tentative="1">
+      <w:start w:val="1"/>
+      <w:numFmt w:val="decimal"/>
+      <w:lvlText w:val="%8."/>
+      <w:lvlJc w:val="left"/>
+      <w:pPr>
+        <w:tabs>
+          <w:tab w:val="num" w:pos="5760"/>
+        </w:tabs>
+        <w:ind w:left="5760" w:hanging="360"/>
+      </w:pPr>
+    </w:lvl>
+    <w:lvl w:ilvl="8" w:tentative="1">
+      <w:start w:val="1"/>
+      <w:numFmt w:val="decimal"/>
+      <w:lvlText w:val="%9."/>
+      <w:lvlJc w:val="left"/>
+      <w:pPr>
+        <w:tabs>
+          <w:tab w:val="num" w:pos="6480"/>
+        </w:tabs>
+        <w:ind w:left="6480" w:hanging="360"/>
+      </w:pPr>
+    </w:lvl>
+  </w:abstractNum>
+  <w:abstractNum w:abstractNumId="9" w15:restartNumberingAfterBreak="0">
     <w:nsid w:val="51B138B5"/>
     <w:multiLevelType w:val="multilevel"/>
     <w:tmpl w:val="8DDE2AAE"/>
@@ -7785,7 +8504,7 @@
       </w:rPr>
     </w:lvl>
   </w:abstractNum>
-  <w:abstractNum w:abstractNumId="8" w15:restartNumberingAfterBreak="0">
+  <w:abstractNum w:abstractNumId="10" w15:restartNumberingAfterBreak="0">
     <w:nsid w:val="524027F7"/>
     <w:multiLevelType w:val="multilevel"/>
     <w:tmpl w:val="1230032C"/>
@@ -7930,7 +8649,7 @@
       </w:rPr>
     </w:lvl>
   </w:abstractNum>
-  <w:abstractNum w:abstractNumId="9" w15:restartNumberingAfterBreak="0">
+  <w:abstractNum w:abstractNumId="11" w15:restartNumberingAfterBreak="0">
     <w:nsid w:val="6ACB48FF"/>
     <w:multiLevelType w:val="hybridMultilevel"/>
     <w:tmpl w:val="576AED86"/>
@@ -8043,7 +8762,7 @@
       </w:rPr>
     </w:lvl>
   </w:abstractNum>
-  <w:abstractNum w:abstractNumId="10" w15:restartNumberingAfterBreak="0">
+  <w:abstractNum w:abstractNumId="12" w15:restartNumberingAfterBreak="0">
     <w:nsid w:val="7B6D6566"/>
     <w:multiLevelType w:val="hybridMultilevel"/>
     <w:tmpl w:val="93022D96"/>
@@ -8156,7 +8875,7 @@
       </w:rPr>
     </w:lvl>
   </w:abstractNum>
-  <w:abstractNum w:abstractNumId="11" w15:restartNumberingAfterBreak="0">
+  <w:abstractNum w:abstractNumId="13" w15:restartNumberingAfterBreak="0">
     <w:nsid w:val="7FEB37AE"/>
     <w:multiLevelType w:val="hybridMultilevel"/>
     <w:tmpl w:val="916EB4A2"/>
@@ -8273,36 +8992,42 @@
     <w:abstractNumId w:val="1"/>
   </w:num>
   <w:num w:numId="2">
-    <w:abstractNumId w:val="10"/>
+    <w:abstractNumId w:val="12"/>
   </w:num>
   <w:num w:numId="3">
-    <w:abstractNumId w:val="3"/>
+    <w:abstractNumId w:val="4"/>
   </w:num>
   <w:num w:numId="4">
-    <w:abstractNumId w:val="11"/>
+    <w:abstractNumId w:val="13"/>
   </w:num>
   <w:num w:numId="5">
     <w:abstractNumId w:val="0"/>
   </w:num>
   <w:num w:numId="6">
-    <w:abstractNumId w:val="5"/>
+    <w:abstractNumId w:val="6"/>
   </w:num>
   <w:num w:numId="7">
     <w:abstractNumId w:val="2"/>
   </w:num>
   <w:num w:numId="8">
-    <w:abstractNumId w:val="6"/>
+    <w:abstractNumId w:val="7"/>
   </w:num>
   <w:num w:numId="9">
+    <w:abstractNumId w:val="11"/>
+  </w:num>
+  <w:num w:numId="10">
+    <w:abstractNumId w:val="5"/>
+  </w:num>
+  <w:num w:numId="11">
     <w:abstractNumId w:val="9"/>
   </w:num>
-  <w:num w:numId="10">
-    <w:abstractNumId w:val="4"/>
+  <w:num w:numId="12">
+    <w:abstractNumId w:val="10"/>
   </w:num>
-  <w:num w:numId="11">
-    <w:abstractNumId w:val="7"/>
+  <w:num w:numId="13">
+    <w:abstractNumId w:val="3"/>
   </w:num>
-  <w:num w:numId="12">
+  <w:num w:numId="14">
     <w:abstractNumId w:val="8"/>
   </w:num>
 </w:numbering>
@@ -8728,6 +9453,29 @@
       <w:lang w:eastAsia="es-CO"/>
     </w:rPr>
   </w:style>
+  <w:style w:type="paragraph" w:styleId="Ttulo4">
+    <w:name w:val="heading 4"/>
+    <w:basedOn w:val="Normal"/>
+    <w:next w:val="Normal"/>
+    <w:link w:val="Ttulo4Car"/>
+    <w:uiPriority w:val="9"/>
+    <w:semiHidden/>
+    <w:unhideWhenUsed/>
+    <w:qFormat/>
+    <w:rsid w:val="00A74AC6"/>
+    <w:pPr>
+      <w:keepNext/>
+      <w:keepLines/>
+      <w:spacing w:before="40" w:after="0"/>
+      <w:outlineLvl w:val="3"/>
+    </w:pPr>
+    <w:rPr>
+      <w:rFonts w:asciiTheme="majorHAnsi" w:eastAsiaTheme="majorEastAsia" w:hAnsiTheme="majorHAnsi" w:cstheme="majorBidi"/>
+      <w:i/>
+      <w:iCs/>
+      <w:color w:val="2F5496" w:themeColor="accent1" w:themeShade="BF"/>
+    </w:rPr>
+  </w:style>
   <w:style w:type="character" w:default="1" w:styleId="Fuentedeprrafopredeter">
     <w:name w:val="Default Paragraph Font"/>
     <w:uiPriority w:val="1"/>
@@ -8878,6 +9626,31 @@
       <w:rFonts w:ascii="Courier New" w:eastAsia="Times New Roman" w:hAnsi="Courier New" w:cs="Courier New"/>
       <w:sz w:val="20"/>
       <w:szCs w:val="20"/>
+    </w:rPr>
+  </w:style>
+  <w:style w:type="character" w:styleId="nfasis">
+    <w:name w:val="Emphasis"/>
+    <w:basedOn w:val="Fuentedeprrafopredeter"/>
+    <w:uiPriority w:val="20"/>
+    <w:qFormat/>
+    <w:rsid w:val="00A74AC6"/>
+    <w:rPr>
+      <w:i/>
+      <w:iCs/>
+    </w:rPr>
+  </w:style>
+  <w:style w:type="character" w:customStyle="1" w:styleId="Ttulo4Car">
+    <w:name w:val="Título 4 Car"/>
+    <w:basedOn w:val="Fuentedeprrafopredeter"/>
+    <w:link w:val="Ttulo4"/>
+    <w:uiPriority w:val="9"/>
+    <w:semiHidden/>
+    <w:rsid w:val="00A74AC6"/>
+    <w:rPr>
+      <w:rFonts w:asciiTheme="majorHAnsi" w:eastAsiaTheme="majorEastAsia" w:hAnsiTheme="majorHAnsi" w:cstheme="majorBidi"/>
+      <w:i/>
+      <w:iCs/>
+      <w:color w:val="2F5496" w:themeColor="accent1" w:themeShade="BF"/>
     </w:rPr>
   </w:style>
 </w:styles>

</xml_diff>